<commit_message>
cv update, small fixes
</commit_message>
<xml_diff>
--- a/resources/CV_Yaqin_Hasan.docx
+++ b/resources/CV_Yaqin_Hasan.docx
@@ -8,11 +8,11 @@
         <w:tabs>
           <w:tab w:val="left" w:leader="none" w:pos="0"/>
         </w:tabs>
-        <w:spacing w:line="240" w:lineRule="auto"/>
+        <w:spacing w:after="200" w:line="240" w:lineRule="auto"/>
         <w:ind w:left="0" w:right="0" w:firstLine="0"/>
-        <w:rPr>
-          <w:sz w:val="48"/>
-          <w:szCs w:val="48"/>
+        <w:jc w:val="center"/>
+        <w:rPr>
+          <w:color w:val="000000"/>
         </w:rPr>
         <w:sectPr>
           <w:pgSz w:h="15840" w:w="12240" w:orient="portrait"/>
@@ -27,89 +27,12 @@
       <w:bookmarkEnd w:id="0"/>
       <w:r>
         <w:rPr>
+          <w:color w:val="000000"/>
           <w:sz w:val="48"/>
           <w:szCs w:val="48"/>
           <w:rtl w:val="0"/>
         </w:rPr>
         <w:t xml:space="preserve">Yaqin Hasan</w:t>
-      </w:r>
-    </w:p>
-    <w:p>
-      <w:pPr>
-        <w:pStyle w:val="Subtitle"/>
-        <w:tabs>
-          <w:tab w:val="right" w:leader="none" w:pos="10800"/>
-        </w:tabs>
-        <w:ind w:right="0"/>
-        <w:jc w:val="right"/>
-        <w:rPr>
-          <w:sz w:val="24"/>
-          <w:szCs w:val="24"/>
-        </w:rPr>
-      </w:pPr>
-      <w:bookmarkStart w:colFirst="0" w:colLast="0" w:name="_indavzceky9x" w:id="1"/>
-      <w:bookmarkEnd w:id="1"/>
-      <w:r>
-        <w:rPr>
-          <w:rFonts w:ascii="Roboto Mono" w:cs="Roboto Mono" w:eastAsia="Roboto Mono" w:hAnsi="Roboto Mono"/>
-          <w:color w:val="000000"/>
-          <w:rtl w:val="0"/>
-        </w:rPr>
-        <w:t xml:space="preserve">Website:</w:t>
-      </w:r>
-      <w:r>
-        <w:rPr>
-          <w:rFonts w:ascii="Roboto Mono" w:cs="Roboto Mono" w:eastAsia="Roboto Mono" w:hAnsi="Roboto Mono"/>
-          <w:rtl w:val="0"/>
-        </w:rPr>
-        <w:t xml:space="preserve"> </w:t>
-      </w:r>
-      <w:r>
-        <w:rPr>
-          <w:rFonts w:ascii="Roboto Mono" w:cs="Roboto Mono" w:eastAsia="Roboto Mono" w:hAnsi="Roboto Mono"/>
-          <w:rtl w:val="0"/>
-        </w:rPr>
-        <w:t xml:space="preserve">yaqinhasan.com</w:t>
-      </w:r>
-      <w:r>
-        <w:rPr>
-          <w:rtl w:val="0"/>
-        </w:rPr>
-      </w:r>
-    </w:p>
-    <w:p>
-      <w:pPr>
-        <w:pStyle w:val="Subtitle"/>
-        <w:ind w:right="0"/>
-        <w:jc w:val="right"/>
-        <w:rPr/>
-        <w:sectPr>
-          <w:type w:val="continuous"/>
-          <w:pgSz w:h="15840" w:w="12240" w:orient="portrait"/>
-          <w:pgMar w:bottom="720" w:top="720" w:left="720" w:right="720" w:header="0" w:footer="720"/>
-          <w:cols w:equalWidth="0" w:num="1">
-            <w:col w:space="0" w:w="10800"/>
-          </w:cols>
-        </w:sectPr>
-      </w:pPr>
-      <w:bookmarkStart w:colFirst="0" w:colLast="0" w:name="_7v3k6sjzpe4o" w:id="2"/>
-      <w:bookmarkEnd w:id="2"/>
-      <w:r>
-        <w:rPr>
-          <w:color w:val="000000"/>
-          <w:sz w:val="24"/>
-          <w:szCs w:val="24"/>
-          <w:rtl w:val="0"/>
-        </w:rPr>
-        <w:t xml:space="preserve">Email:</w:t>
-      </w:r>
-      <w:r>
-        <w:rPr>
-          <w:sz w:val="24"/>
-          <w:szCs w:val="24"/>
-          <w:rtl w:val="0"/>
-        </w:rPr>
-        <w:t xml:space="preserve"> yaqin.k.hasan@gmail.com</w:t>
       </w:r>
       <w:r>
         <w:rPr>
@@ -128,25 +51,25 @@
           <w:between w:space="0" w:sz="0" w:val="nil"/>
         </w:pBdr>
         <w:shd w:fill="auto" w:val="clear"/>
-        <w:spacing w:line="240" w:lineRule="auto"/>
+        <w:spacing w:after="80" w:before="0" w:line="240" w:lineRule="auto"/>
         <w:ind w:left="0" w:right="0" w:firstLine="0"/>
         <w:rPr>
-          <w:rFonts w:ascii="Noto Sans" w:cs="Noto Sans" w:eastAsia="Noto Sans" w:hAnsi="Noto Sans"/>
-        </w:rPr>
-      </w:pPr>
-      <w:r>
-        <w:rPr>
-          <w:rFonts w:ascii="Noto Sans" w:cs="Noto Sans" w:eastAsia="Noto Sans" w:hAnsi="Noto Sans"/>
-          <w:rtl w:val="0"/>
-        </w:rPr>
-        <w:t xml:space="preserve">    </w:t>
-      </w:r>
-      <w:r>
-        <w:rPr>
-          <w:rFonts w:ascii="Noto Sans" w:cs="Noto Sans" w:eastAsia="Noto Sans" w:hAnsi="Noto Sans"/>
-          <w:rtl w:val="0"/>
-        </w:rPr>
-        <w:t xml:space="preserve">I am a 20 year old computer science graduate with solid software engineering skills in multiple popular languages and frameworks. I am quick to learn and eager to develop new skills in a challenging yet stimulating work environment.  </w:t>
+          <w:rFonts w:ascii="Noto Sans SemiBold" w:cs="Noto Sans SemiBold" w:eastAsia="Noto Sans SemiBold" w:hAnsi="Noto Sans SemiBold"/>
+        </w:rPr>
+      </w:pPr>
+      <w:r>
+        <w:rPr>
+          <w:rFonts w:ascii="Noto Sans Medium" w:cs="Noto Sans Medium" w:eastAsia="Noto Sans Medium" w:hAnsi="Noto Sans Medium"/>
+          <w:rtl w:val="0"/>
+        </w:rPr>
+        <w:t xml:space="preserve">   </w:t>
+      </w:r>
+      <w:r>
+        <w:rPr>
+          <w:rFonts w:ascii="Noto Sans SemiBold" w:cs="Noto Sans SemiBold" w:eastAsia="Noto Sans SemiBold" w:hAnsi="Noto Sans SemiBold"/>
+          <w:rtl w:val="0"/>
+        </w:rPr>
+        <w:t xml:space="preserve"> I am a 20 year old recent computer science graduate with solid software engineering skills backed by a deep understanding of hardware architectures and a decade-long passion for all things computing. </w:t>
       </w:r>
     </w:p>
     <w:p>
@@ -160,51 +83,80 @@
           <w:between w:space="0" w:sz="0" w:val="nil"/>
         </w:pBdr>
         <w:shd w:fill="auto" w:val="clear"/>
-        <w:spacing w:line="240" w:lineRule="auto"/>
+        <w:spacing w:before="0" w:line="240" w:lineRule="auto"/>
         <w:ind w:left="0" w:right="0" w:firstLine="0"/>
-        <w:jc w:val="center"/>
-        <w:rPr>
-          <w:rFonts w:ascii="JetBrains Mono" w:cs="JetBrains Mono" w:eastAsia="JetBrains Mono" w:hAnsi="JetBrains Mono"/>
+        <w:rPr>
+          <w:rFonts w:ascii="Noto Sans SemiBold" w:cs="Noto Sans SemiBold" w:eastAsia="Noto Sans SemiBold" w:hAnsi="Noto Sans SemiBold"/>
+        </w:rPr>
+      </w:pPr>
+      <w:r>
+        <w:rPr>
+          <w:rFonts w:ascii="Noto Sans SemiBold" w:cs="Noto Sans SemiBold" w:eastAsia="Noto Sans SemiBold" w:hAnsi="Noto Sans SemiBold"/>
+          <w:rtl w:val="0"/>
+        </w:rPr>
+        <w:t xml:space="preserve">    I look forward to a role where I can get hands on and play my part in shaping the future of computing. </w:t>
+      </w:r>
+    </w:p>
+    <w:p>
+      <w:pPr>
+        <w:spacing w:after="80" w:before="0" w:lineRule="auto"/>
+        <w:jc w:val="right"/>
+        <w:rPr>
           <w:b w:val="1"/>
-        </w:rPr>
-      </w:pPr>
-      <w:r>
-        <w:rPr>
-          <w:rFonts w:ascii="Noto Sans" w:cs="Noto Sans" w:eastAsia="Noto Sans" w:hAnsi="Noto Sans"/>
+          <w:sz w:val="26"/>
+          <w:szCs w:val="26"/>
+        </w:rPr>
+      </w:pPr>
+      <w:r>
+        <w:rPr>
+          <w:rFonts w:ascii="Noto Sans SemiBold" w:cs="Noto Sans SemiBold" w:eastAsia="Noto Sans SemiBold" w:hAnsi="Noto Sans SemiBold"/>
+          <w:sz w:val="26"/>
+          <w:szCs w:val="26"/>
+          <w:rtl w:val="0"/>
+        </w:rPr>
+        <w:t xml:space="preserve">Website: </w:t>
+      </w:r>
+      <w:r>
+        <w:rPr>
           <w:b w:val="1"/>
-          <w:sz w:val="20"/>
-          <w:szCs w:val="20"/>
-          <w:rtl w:val="0"/>
-        </w:rPr>
-        <w:tab/>
-        <w:t xml:space="preserve">Please check</w:t>
-      </w:r>
-      <w:r>
-        <w:rPr>
-          <w:rFonts w:ascii="Noto Sans" w:cs="Noto Sans" w:eastAsia="Noto Sans" w:hAnsi="Noto Sans"/>
-          <w:b w:val="1"/>
-          <w:sz w:val="20"/>
-          <w:szCs w:val="20"/>
-          <w:rtl w:val="0"/>
-        </w:rPr>
-        <w:t xml:space="preserve"> out my website on the top right of this page for links to my Github and Linkedin profiles as well as a detailed explanation of my projects. </w:t>
-      </w:r>
-      <w:r>
-        <w:pict>
-          <v:rect style="width:0.0pt;height:1.5pt" o:hr="t" o:hrstd="t" o:hralign="center" fillcolor="#A0A0A0" stroked="f"/>
-        </w:pict>
-      </w:r>
-      <w:r>
-        <w:rPr>
-          <w:rtl w:val="0"/>
-        </w:rPr>
-      </w:r>
-    </w:p>
-    <w:p>
-      <w:pPr>
-        <w:pStyle w:val="Heading1"/>
-        <w:keepNext w:val="0"/>
-        <w:keepLines w:val="0"/>
+          <w:sz w:val="26"/>
+          <w:szCs w:val="26"/>
+          <w:rtl w:val="0"/>
+        </w:rPr>
+        <w:t xml:space="preserve">yaqinhasan.com</w:t>
+      </w:r>
+    </w:p>
+    <w:p>
+      <w:pPr>
+        <w:spacing w:after="80" w:before="0" w:lineRule="auto"/>
+        <w:jc w:val="right"/>
+        <w:rPr>
+          <w:rFonts w:ascii="JetBrains Mono SemiBold" w:cs="JetBrains Mono SemiBold" w:eastAsia="JetBrains Mono SemiBold" w:hAnsi="JetBrains Mono SemiBold"/>
+          <w:sz w:val="26"/>
+          <w:szCs w:val="26"/>
+        </w:rPr>
+      </w:pPr>
+      <w:r>
+        <w:rPr>
+          <w:rFonts w:ascii="Noto Sans SemiBold" w:cs="Noto Sans SemiBold" w:eastAsia="Noto Sans SemiBold" w:hAnsi="Noto Sans SemiBold"/>
+          <w:sz w:val="26"/>
+          <w:szCs w:val="26"/>
+          <w:rtl w:val="0"/>
+        </w:rPr>
+        <w:t xml:space="preserve">Email: </w:t>
+      </w:r>
+      <w:r>
+        <w:rPr>
+          <w:rFonts w:ascii="JetBrains Mono SemiBold" w:cs="JetBrains Mono SemiBold" w:eastAsia="JetBrains Mono SemiBold" w:hAnsi="JetBrains Mono SemiBold"/>
+          <w:sz w:val="26"/>
+          <w:szCs w:val="26"/>
+          <w:rtl w:val="0"/>
+        </w:rPr>
+        <w:t xml:space="preserve">yaqin.k.hasan@gmail.com</w:t>
+      </w:r>
+    </w:p>
+    <w:p>
+      <w:pPr>
         <w:pageBreakBefore w:val="0"/>
         <w:pBdr>
           <w:top w:space="0" w:sz="0" w:val="nil"/>
@@ -214,53 +166,124 @@
           <w:between w:space="0" w:sz="0" w:val="nil"/>
         </w:pBdr>
         <w:shd w:fill="auto" w:val="clear"/>
-        <w:spacing w:after="200" w:before="200" w:line="240" w:lineRule="auto"/>
+        <w:spacing w:before="0" w:line="240" w:lineRule="auto"/>
         <w:ind w:left="0" w:right="0" w:firstLine="0"/>
         <w:rPr>
-          <w:rFonts w:ascii="JetBrains Mono" w:cs="JetBrains Mono" w:eastAsia="JetBrains Mono" w:hAnsi="JetBrains Mono"/>
-          <w:b w:val="1"/>
-          <w:color w:val="53bb84"/>
-          <w:sz w:val="32"/>
-          <w:szCs w:val="32"/>
-        </w:rPr>
-      </w:pPr>
-      <w:bookmarkStart w:colFirst="0" w:colLast="0" w:name="_5sh58lh512k2" w:id="3"/>
-      <w:bookmarkEnd w:id="3"/>
-      <w:r>
-        <w:rPr>
-          <w:rFonts w:ascii="JetBrains Mono" w:cs="JetBrains Mono" w:eastAsia="JetBrains Mono" w:hAnsi="JetBrains Mono"/>
-          <w:b w:val="1"/>
+          <w:rFonts w:ascii="Noto Sans SemiBold" w:cs="Noto Sans SemiBold" w:eastAsia="Noto Sans SemiBold" w:hAnsi="Noto Sans SemiBold"/>
+          <w:sz w:val="26"/>
+          <w:szCs w:val="26"/>
+        </w:rPr>
+      </w:pPr>
+      <w:r>
+        <w:rPr>
+          <w:rtl w:val="0"/>
+        </w:rPr>
+      </w:r>
+    </w:p>
+    <w:p>
+      <w:pPr>
+        <w:pageBreakBefore w:val="0"/>
+        <w:pBdr>
+          <w:top w:space="0" w:sz="0" w:val="nil"/>
+          <w:left w:space="0" w:sz="0" w:val="nil"/>
+          <w:bottom w:space="0" w:sz="0" w:val="nil"/>
+          <w:right w:space="0" w:sz="0" w:val="nil"/>
+          <w:between w:space="0" w:sz="0" w:val="nil"/>
+        </w:pBdr>
+        <w:shd w:fill="auto" w:val="clear"/>
+        <w:spacing w:before="0" w:line="240" w:lineRule="auto"/>
+        <w:ind w:left="0" w:right="0" w:firstLine="0"/>
+        <w:jc w:val="both"/>
+        <w:rPr>
+          <w:rFonts w:ascii="Noto Sans SemiBold" w:cs="Noto Sans SemiBold" w:eastAsia="Noto Sans SemiBold" w:hAnsi="Noto Sans SemiBold"/>
+          <w:sz w:val="26"/>
+          <w:szCs w:val="26"/>
+        </w:rPr>
+        <w:sectPr>
+          <w:type w:val="continuous"/>
+          <w:pgSz w:h="15840" w:w="12240" w:orient="portrait"/>
+          <w:pgMar w:bottom="720" w:top="720" w:left="720" w:right="720" w:header="0" w:footer="720"/>
+          <w:cols w:equalWidth="0" w:num="2" w:sep="1">
+            <w:col w:space="287.97999999999996" w:w="5256"/>
+            <w:col w:space="0" w:w="5256"/>
+          </w:cols>
+        </w:sectPr>
+      </w:pPr>
+      <w:r>
+        <w:rPr>
+          <w:rFonts w:ascii="Noto Sans SemiBold" w:cs="Noto Sans SemiBold" w:eastAsia="Noto Sans SemiBold" w:hAnsi="Noto Sans SemiBold"/>
+          <w:sz w:val="26"/>
+          <w:szCs w:val="26"/>
+          <w:rtl w:val="0"/>
+        </w:rPr>
+        <w:t xml:space="preserve">Please check out my website for further details about the projects and personal interests I have mentioned in this CV.</w:t>
+      </w:r>
+    </w:p>
+    <w:p>
+      <w:pPr>
+        <w:pageBreakBefore w:val="0"/>
+        <w:pBdr>
+          <w:top w:space="0" w:sz="0" w:val="nil"/>
+          <w:left w:space="0" w:sz="0" w:val="nil"/>
+          <w:bottom w:space="0" w:sz="0" w:val="nil"/>
+          <w:right w:space="0" w:sz="0" w:val="nil"/>
+          <w:between w:space="0" w:sz="0" w:val="nil"/>
+        </w:pBdr>
+        <w:shd w:fill="auto" w:val="clear"/>
+        <w:spacing w:before="0" w:line="240" w:lineRule="auto"/>
+        <w:ind w:left="0" w:right="0" w:firstLine="0"/>
+        <w:jc w:val="left"/>
+        <w:rPr>
+          <w:rFonts w:ascii="Noto Sans Medium" w:cs="Noto Sans Medium" w:eastAsia="Noto Sans Medium" w:hAnsi="Noto Sans Medium"/>
           <w:sz w:val="28"/>
           <w:szCs w:val="28"/>
+        </w:rPr>
+      </w:pPr>
+      <w:r>
+        <w:pict>
+          <v:rect style="width:0.0pt;height:1.5pt" o:hr="t" o:hrstd="t" o:hralign="center" fillcolor="#A0A0A0" stroked="f"/>
+        </w:pict>
+      </w:r>
+      <w:r>
+        <w:rPr>
+          <w:rtl w:val="0"/>
+        </w:rPr>
+      </w:r>
+    </w:p>
+    <w:p>
+      <w:pPr>
+        <w:pStyle w:val="Subtitle"/>
+        <w:keepNext w:val="0"/>
+        <w:keepLines w:val="0"/>
+        <w:rPr/>
+      </w:pPr>
+      <w:bookmarkStart w:colFirst="0" w:colLast="0" w:name="_5sh58lh512k2" w:id="1"/>
+      <w:bookmarkEnd w:id="1"/>
+      <w:r>
+        <w:rPr>
           <w:rtl w:val="0"/>
         </w:rPr>
         <w:t xml:space="preserve">Education</w:t>
       </w:r>
-      <w:r>
-        <w:rPr>
-          <w:rtl w:val="0"/>
-        </w:rPr>
-      </w:r>
     </w:p>
     <w:p>
       <w:pPr>
         <w:pStyle w:val="Heading1"/>
-        <w:spacing w:line="240" w:lineRule="auto"/>
-        <w:ind w:left="0" w:right="0" w:firstLine="0"/>
-        <w:rPr>
+        <w:spacing w:before="0" w:lineRule="auto"/>
+        <w:rPr>
+          <w:rFonts w:ascii="Noto Sans Medium" w:cs="Noto Sans Medium" w:eastAsia="Noto Sans Medium" w:hAnsi="Noto Sans Medium"/>
+          <w:sz w:val="26"/>
+          <w:szCs w:val="26"/>
           <w:u w:val="single"/>
         </w:rPr>
       </w:pPr>
-      <w:bookmarkStart w:colFirst="0" w:colLast="0" w:name="_mu43qcboozqe" w:id="4"/>
-      <w:bookmarkEnd w:id="4"/>
-      <w:r>
-        <w:rPr>
-          <w:rtl w:val="0"/>
-        </w:rPr>
-        <w:t xml:space="preserve">  </w:t>
-      </w:r>
-      <w:r>
-        <w:rPr>
+      <w:bookmarkStart w:colFirst="0" w:colLast="0" w:name="_mu43qcboozqe" w:id="2"/>
+      <w:bookmarkEnd w:id="2"/>
+      <w:r>
+        <w:rPr>
+          <w:rFonts w:ascii="Noto Sans Medium" w:cs="Noto Sans Medium" w:eastAsia="Noto Sans Medium" w:hAnsi="Noto Sans Medium"/>
+          <w:sz w:val="26"/>
+          <w:szCs w:val="26"/>
           <w:u w:val="single"/>
           <w:rtl w:val="0"/>
         </w:rPr>
@@ -272,27 +295,36 @@
         <w:pStyle w:val="Heading2"/>
         <w:keepNext w:val="0"/>
         <w:keepLines w:val="0"/>
-        <w:rPr>
-          <w:rFonts w:ascii="JetBrains Mono" w:cs="JetBrains Mono" w:eastAsia="JetBrains Mono" w:hAnsi="JetBrains Mono"/>
+        <w:spacing w:after="40" w:before="40" w:lineRule="auto"/>
+        <w:rPr>
+          <w:rFonts w:ascii="Noto Sans Medium" w:cs="Noto Sans Medium" w:eastAsia="Noto Sans Medium" w:hAnsi="Noto Sans Medium"/>
           <w:i w:val="1"/>
-          <w:color w:val="434343"/>
-          <w:sz w:val="20"/>
-          <w:szCs w:val="20"/>
-        </w:rPr>
-      </w:pPr>
-      <w:bookmarkStart w:colFirst="0" w:colLast="0" w:name="_gcnvrnaqe77d" w:id="5"/>
-      <w:bookmarkEnd w:id="5"/>
-      <w:r>
-        <w:rPr>
-          <w:rtl w:val="0"/>
-        </w:rPr>
-        <w:t xml:space="preserve">    </w:t>
-      </w:r>
-      <w:r>
-        <w:rPr>
-          <w:rtl w:val="0"/>
-        </w:rPr>
-        <w:t xml:space="preserve">BSc Computer Science - Second Class Honours 2020 - 2023</w:t>
+          <w:color w:val="000000"/>
+          <w:sz w:val="24"/>
+          <w:szCs w:val="24"/>
+        </w:rPr>
+      </w:pPr>
+      <w:bookmarkStart w:colFirst="0" w:colLast="0" w:name="_gcnvrnaqe77d" w:id="3"/>
+      <w:bookmarkEnd w:id="3"/>
+      <w:r>
+        <w:rPr>
+          <w:rFonts w:ascii="Noto Sans Medium" w:cs="Noto Sans Medium" w:eastAsia="Noto Sans Medium" w:hAnsi="Noto Sans Medium"/>
+          <w:color w:val="000000"/>
+          <w:sz w:val="24"/>
+          <w:szCs w:val="24"/>
+          <w:rtl w:val="0"/>
+        </w:rPr>
+        <w:t xml:space="preserve">  </w:t>
+      </w:r>
+      <w:r>
+        <w:rPr>
+          <w:rFonts w:ascii="Noto Sans Medium" w:cs="Noto Sans Medium" w:eastAsia="Noto Sans Medium" w:hAnsi="Noto Sans Medium"/>
+          <w:color w:val="000000"/>
+          <w:sz w:val="24"/>
+          <w:szCs w:val="24"/>
+          <w:rtl w:val="0"/>
+        </w:rPr>
+        <w:t xml:space="preserve">BSc Computer Science - Second Class Honours (2020 - 2023)</w:t>
       </w:r>
       <w:r>
         <w:rPr>
@@ -315,18 +347,23 @@
           <w:between w:space="0" w:sz="0" w:val="nil"/>
         </w:pBdr>
         <w:shd w:fill="auto" w:val="clear"/>
-        <w:spacing w:before="120" w:line="240" w:lineRule="auto"/>
+        <w:spacing w:after="40" w:before="0" w:line="240" w:lineRule="auto"/>
         <w:ind w:left="720" w:right="0" w:hanging="360"/>
         <w:rPr>
-          <w:rFonts w:ascii="Noto Sans" w:cs="Noto Sans" w:eastAsia="Noto Sans" w:hAnsi="Noto Sans"/>
-        </w:rPr>
-      </w:pPr>
-      <w:r>
-        <w:rPr>
-          <w:rFonts w:ascii="Noto Sans" w:cs="Noto Sans" w:eastAsia="Noto Sans" w:hAnsi="Noto Sans"/>
-          <w:rtl w:val="0"/>
-        </w:rPr>
-        <w:t xml:space="preserve">Including software engineering modules in Java and C, including group projects done using AGILE principles, MVC design pattern, and Git VCS. </w:t>
+          <w:rFonts w:ascii="Noto Sans Medium" w:cs="Noto Sans Medium" w:eastAsia="Noto Sans Medium" w:hAnsi="Noto Sans Medium"/>
+        </w:rPr>
+      </w:pPr>
+      <w:r>
+        <w:rPr>
+          <w:rFonts w:ascii="Noto Sans Medium" w:cs="Noto Sans Medium" w:eastAsia="Noto Sans Medium" w:hAnsi="Noto Sans Medium"/>
+          <w:rtl w:val="0"/>
+        </w:rPr>
+        <w:t xml:space="preserve">Developed Java software with a team of student developers using AGILE development practices and MVC design pattern. </w:t>
+      </w:r>
+      <w:r>
+        <w:rPr>
+          <w:rtl w:val="0"/>
+        </w:rPr>
       </w:r>
     </w:p>
     <w:p>
@@ -344,18 +381,18 @@
           <w:between w:space="0" w:sz="0" w:val="nil"/>
         </w:pBdr>
         <w:shd w:fill="auto" w:val="clear"/>
-        <w:spacing w:after="0" w:before="120" w:line="240" w:lineRule="auto"/>
+        <w:spacing w:after="40" w:before="0" w:line="240" w:lineRule="auto"/>
         <w:ind w:left="720" w:right="0" w:hanging="360"/>
         <w:rPr>
-          <w:rFonts w:ascii="Noto Sans" w:cs="Noto Sans" w:eastAsia="Noto Sans" w:hAnsi="Noto Sans"/>
-        </w:rPr>
-      </w:pPr>
-      <w:r>
-        <w:rPr>
-          <w:rFonts w:ascii="Noto Sans" w:cs="Noto Sans" w:eastAsia="Noto Sans" w:hAnsi="Noto Sans"/>
-          <w:rtl w:val="0"/>
-        </w:rPr>
-        <w:t xml:space="preserve">Including modules covering programming language theory, compiler design and assembly programming. </w:t>
+          <w:rFonts w:ascii="Noto Sans Medium" w:cs="Noto Sans Medium" w:eastAsia="Noto Sans Medium" w:hAnsi="Noto Sans Medium"/>
+        </w:rPr>
+      </w:pPr>
+      <w:r>
+        <w:rPr>
+          <w:rFonts w:ascii="Noto Sans Medium" w:cs="Noto Sans Medium" w:eastAsia="Noto Sans Medium" w:hAnsi="Noto Sans Medium"/>
+          <w:rtl w:val="0"/>
+        </w:rPr>
+        <w:t xml:space="preserve">Studied modules covering assembly programming, compiler design and programming language theory. </w:t>
       </w:r>
     </w:p>
     <w:p>
@@ -373,18 +410,18 @@
           <w:between w:space="0" w:sz="0" w:val="nil"/>
         </w:pBdr>
         <w:shd w:fill="auto" w:val="clear"/>
-        <w:spacing w:after="0" w:before="120" w:line="240" w:lineRule="auto"/>
+        <w:spacing w:after="40" w:before="0" w:line="240" w:lineRule="auto"/>
         <w:ind w:left="720" w:right="0" w:hanging="360"/>
         <w:rPr>
-          <w:rFonts w:ascii="Noto Sans" w:cs="Noto Sans" w:eastAsia="Noto Sans" w:hAnsi="Noto Sans"/>
-        </w:rPr>
-      </w:pPr>
-      <w:r>
-        <w:rPr>
-          <w:rFonts w:ascii="Noto Sans" w:cs="Noto Sans" w:eastAsia="Noto Sans" w:hAnsi="Noto Sans"/>
-          <w:rtl w:val="0"/>
-        </w:rPr>
-        <w:t xml:space="preserve">Including advanced computer systems and computer architecture modules covering CPU design, memory architectures and architecture performance simulation. </w:t>
+          <w:rFonts w:ascii="Noto Sans Medium" w:cs="Noto Sans Medium" w:eastAsia="Noto Sans Medium" w:hAnsi="Noto Sans Medium"/>
+        </w:rPr>
+      </w:pPr>
+      <w:r>
+        <w:rPr>
+          <w:rFonts w:ascii="Noto Sans Medium" w:cs="Noto Sans Medium" w:eastAsia="Noto Sans Medium" w:hAnsi="Noto Sans Medium"/>
+          <w:rtl w:val="0"/>
+        </w:rPr>
+        <w:t xml:space="preserve">Studied modules covering advanced computer architecture, including topics such as CPU design, GPU design and memory architectures. </w:t>
       </w:r>
     </w:p>
     <w:p>
@@ -402,18 +439,18 @@
           <w:between w:space="0" w:sz="0" w:val="nil"/>
         </w:pBdr>
         <w:shd w:fill="auto" w:val="clear"/>
-        <w:spacing w:after="0" w:before="120" w:line="240" w:lineRule="auto"/>
+        <w:spacing w:after="40" w:before="0" w:line="240" w:lineRule="auto"/>
         <w:ind w:left="720" w:right="0" w:hanging="360"/>
         <w:rPr>
-          <w:rFonts w:ascii="Noto Sans" w:cs="Noto Sans" w:eastAsia="Noto Sans" w:hAnsi="Noto Sans"/>
-        </w:rPr>
-      </w:pPr>
-      <w:r>
-        <w:rPr>
-          <w:rFonts w:ascii="Noto Sans" w:cs="Noto Sans" w:eastAsia="Noto Sans" w:hAnsi="Noto Sans"/>
-          <w:rtl w:val="0"/>
-        </w:rPr>
-        <w:t xml:space="preserve">Including modules covering relational database theory and SQL fundamentals. </w:t>
+          <w:rFonts w:ascii="Noto Sans Medium" w:cs="Noto Sans Medium" w:eastAsia="Noto Sans Medium" w:hAnsi="Noto Sans Medium"/>
+        </w:rPr>
+      </w:pPr>
+      <w:r>
+        <w:rPr>
+          <w:rFonts w:ascii="Noto Sans Medium" w:cs="Noto Sans Medium" w:eastAsia="Noto Sans Medium" w:hAnsi="Noto Sans Medium"/>
+          <w:rtl w:val="0"/>
+        </w:rPr>
+        <w:t xml:space="preserve">Performed performance analysis on different hardware designs using full system simulation software and optimised accordingly. </w:t>
       </w:r>
     </w:p>
     <w:p>
@@ -431,18 +468,18 @@
           <w:between w:space="0" w:sz="0" w:val="nil"/>
         </w:pBdr>
         <w:shd w:fill="auto" w:val="clear"/>
-        <w:spacing w:after="0" w:before="120" w:line="240" w:lineRule="auto"/>
+        <w:spacing w:after="40" w:before="0" w:line="240" w:lineRule="auto"/>
         <w:ind w:left="720" w:right="0" w:hanging="360"/>
         <w:rPr>
-          <w:rFonts w:ascii="Noto Sans" w:cs="Noto Sans" w:eastAsia="Noto Sans" w:hAnsi="Noto Sans"/>
-        </w:rPr>
-      </w:pPr>
-      <w:r>
-        <w:rPr>
-          <w:rFonts w:ascii="Noto Sans" w:cs="Noto Sans" w:eastAsia="Noto Sans" w:hAnsi="Noto Sans"/>
-          <w:rtl w:val="0"/>
-        </w:rPr>
-        <w:t xml:space="preserve">Including modules covering the TCP/IP network architecture model, distributed systems theory and RESTful APIs.</w:t>
+          <w:rFonts w:ascii="Noto Sans Medium" w:cs="Noto Sans Medium" w:eastAsia="Noto Sans Medium" w:hAnsi="Noto Sans Medium"/>
+        </w:rPr>
+      </w:pPr>
+      <w:r>
+        <w:rPr>
+          <w:rFonts w:ascii="Noto Sans Medium" w:cs="Noto Sans Medium" w:eastAsia="Noto Sans Medium" w:hAnsi="Noto Sans Medium"/>
+          <w:rtl w:val="0"/>
+        </w:rPr>
+        <w:t xml:space="preserve">Studied modules covering relational database theory and SQL fundamentals. </w:t>
       </w:r>
     </w:p>
     <w:p>
@@ -460,23 +497,27 @@
           <w:between w:space="0" w:sz="0" w:val="nil"/>
         </w:pBdr>
         <w:shd w:fill="auto" w:val="clear"/>
-        <w:spacing w:before="120" w:line="240" w:lineRule="auto"/>
+        <w:spacing w:after="40" w:before="0" w:line="240" w:lineRule="auto"/>
         <w:ind w:left="720" w:right="0" w:hanging="360"/>
         <w:rPr>
-          <w:rFonts w:ascii="Noto Sans" w:cs="Noto Sans" w:eastAsia="Noto Sans" w:hAnsi="Noto Sans"/>
-        </w:rPr>
-      </w:pPr>
-      <w:r>
-        <w:rPr>
-          <w:rFonts w:ascii="Noto Sans" w:cs="Noto Sans" w:eastAsia="Noto Sans" w:hAnsi="Noto Sans"/>
-          <w:rtl w:val="0"/>
-        </w:rPr>
-        <w:t xml:space="preserve">Final year project involving robotics, electronics (sensors, cameras), machine-vision, and programming in resource constrained environments. </w:t>
+          <w:rFonts w:ascii="Noto Sans Medium" w:cs="Noto Sans Medium" w:eastAsia="Noto Sans Medium" w:hAnsi="Noto Sans Medium"/>
+        </w:rPr>
+      </w:pPr>
+      <w:r>
+        <w:rPr>
+          <w:rFonts w:ascii="Noto Sans Medium" w:cs="Noto Sans Medium" w:eastAsia="Noto Sans Medium" w:hAnsi="Noto Sans Medium"/>
+          <w:rtl w:val="0"/>
+        </w:rPr>
+        <w:t xml:space="preserve">Studied modules covering the TCP/IP network architecture model, distributed systems theory and RESTful APIs.</w:t>
       </w:r>
     </w:p>
     <w:p>
       <w:pPr>
         <w:pageBreakBefore w:val="0"/>
+        <w:numPr>
+          <w:ilvl w:val="0"/>
+          <w:numId w:val="1"/>
+        </w:numPr>
         <w:pBdr>
           <w:top w:space="0" w:sz="0" w:val="nil"/>
           <w:left w:space="0" w:sz="0" w:val="nil"/>
@@ -485,12 +526,19 @@
           <w:between w:space="0" w:sz="0" w:val="nil"/>
         </w:pBdr>
         <w:shd w:fill="auto" w:val="clear"/>
-        <w:spacing w:before="120" w:line="240" w:lineRule="auto"/>
-        <w:ind w:right="0"/>
-        <w:rPr>
-          <w:rFonts w:ascii="Noto Sans" w:cs="Noto Sans" w:eastAsia="Noto Sans" w:hAnsi="Noto Sans"/>
-        </w:rPr>
-      </w:pPr>
+        <w:spacing w:after="40" w:before="0" w:line="240" w:lineRule="auto"/>
+        <w:ind w:left="720" w:right="0" w:hanging="360"/>
+        <w:rPr>
+          <w:rFonts w:ascii="Noto Sans Medium" w:cs="Noto Sans Medium" w:eastAsia="Noto Sans Medium" w:hAnsi="Noto Sans Medium"/>
+        </w:rPr>
+      </w:pPr>
+      <w:r>
+        <w:rPr>
+          <w:rFonts w:ascii="Noto Sans Medium" w:cs="Noto Sans Medium" w:eastAsia="Noto Sans Medium" w:hAnsi="Noto Sans Medium"/>
+          <w:rtl w:val="0"/>
+        </w:rPr>
+        <w:t xml:space="preserve">Completed a final year project involving robotics, electronics (sensors, cameras) and machine vision. </w:t>
+      </w:r>
       <w:r>
         <w:rPr>
           <w:rtl w:val="0"/>
@@ -502,28 +550,22 @@
         <w:pStyle w:val="Heading1"/>
         <w:keepNext w:val="0"/>
         <w:keepLines w:val="0"/>
-        <w:spacing w:line="240" w:lineRule="auto"/>
+        <w:spacing w:before="80" w:line="240" w:lineRule="auto"/>
         <w:ind w:left="0" w:right="0" w:firstLine="0"/>
         <w:rPr>
+          <w:rFonts w:ascii="Noto Sans Medium" w:cs="Noto Sans Medium" w:eastAsia="Noto Sans Medium" w:hAnsi="Noto Sans Medium"/>
+          <w:sz w:val="26"/>
+          <w:szCs w:val="26"/>
           <w:u w:val="single"/>
         </w:rPr>
       </w:pPr>
-      <w:bookmarkStart w:colFirst="0" w:colLast="0" w:name="_25ksbxwbal7a" w:id="6"/>
-      <w:bookmarkEnd w:id="6"/>
-      <w:r>
-        <w:rPr>
-          <w:rtl w:val="0"/>
-        </w:rPr>
-        <w:t xml:space="preserve"> </w:t>
-      </w:r>
-      <w:r>
-        <w:rPr>
-          <w:rtl w:val="0"/>
-        </w:rPr>
-        <w:t xml:space="preserve"> </w:t>
-      </w:r>
-      <w:r>
-        <w:rPr>
+      <w:bookmarkStart w:colFirst="0" w:colLast="0" w:name="_25ksbxwbal7a" w:id="4"/>
+      <w:bookmarkEnd w:id="4"/>
+      <w:r>
+        <w:rPr>
+          <w:rFonts w:ascii="Noto Sans Medium" w:cs="Noto Sans Medium" w:eastAsia="Noto Sans Medium" w:hAnsi="Noto Sans Medium"/>
+          <w:sz w:val="26"/>
+          <w:szCs w:val="26"/>
           <w:u w:val="single"/>
           <w:rtl w:val="0"/>
         </w:rPr>
@@ -535,26 +577,35 @@
         <w:pStyle w:val="Heading2"/>
         <w:keepNext w:val="0"/>
         <w:keepLines w:val="0"/>
-        <w:rPr>
-          <w:rFonts w:ascii="JetBrains Mono" w:cs="JetBrains Mono" w:eastAsia="JetBrains Mono" w:hAnsi="JetBrains Mono"/>
-          <w:b w:val="0"/>
-          <w:sz w:val="20"/>
-          <w:szCs w:val="20"/>
-        </w:rPr>
-      </w:pPr>
-      <w:bookmarkStart w:colFirst="0" w:colLast="0" w:name="_tma4fqpb9878" w:id="7"/>
-      <w:bookmarkEnd w:id="7"/>
-      <w:r>
-        <w:rPr>
-          <w:rtl w:val="0"/>
-        </w:rPr>
-        <w:t xml:space="preserve">    </w:t>
-      </w:r>
-      <w:r>
-        <w:rPr>
-          <w:rtl w:val="0"/>
-        </w:rPr>
-        <w:t xml:space="preserve">Engineering Foundation Year 2019 - 2020</w:t>
+        <w:spacing w:after="40" w:before="40" w:lineRule="auto"/>
+        <w:rPr>
+          <w:rFonts w:ascii="Noto Sans Medium" w:cs="Noto Sans Medium" w:eastAsia="Noto Sans Medium" w:hAnsi="Noto Sans Medium"/>
+          <w:color w:val="000000"/>
+          <w:sz w:val="24"/>
+          <w:szCs w:val="24"/>
+        </w:rPr>
+      </w:pPr>
+      <w:bookmarkStart w:colFirst="0" w:colLast="0" w:name="_tma4fqpb9878" w:id="5"/>
+      <w:bookmarkEnd w:id="5"/>
+      <w:r>
+        <w:rPr>
+          <w:rFonts w:ascii="Noto Sans Medium" w:cs="Noto Sans Medium" w:eastAsia="Noto Sans Medium" w:hAnsi="Noto Sans Medium"/>
+          <w:color w:val="000000"/>
+          <w:sz w:val="24"/>
+          <w:szCs w:val="24"/>
+          <w:rtl w:val="0"/>
+        </w:rPr>
+        <w:t xml:space="preserve">  </w:t>
+      </w:r>
+      <w:r>
+        <w:rPr>
+          <w:rFonts w:ascii="Noto Sans Medium" w:cs="Noto Sans Medium" w:eastAsia="Noto Sans Medium" w:hAnsi="Noto Sans Medium"/>
+          <w:color w:val="000000"/>
+          <w:sz w:val="24"/>
+          <w:szCs w:val="24"/>
+          <w:rtl w:val="0"/>
+        </w:rPr>
+        <w:t xml:space="preserve">Engineering Foundation Year (2019 - 2020)</w:t>
       </w:r>
       <w:r>
         <w:rPr>
@@ -577,35 +628,19 @@
           <w:between w:space="0" w:sz="0" w:val="nil"/>
         </w:pBdr>
         <w:shd w:fill="auto" w:val="clear"/>
-        <w:spacing w:before="120" w:line="240" w:lineRule="auto"/>
+        <w:spacing w:after="40" w:before="0" w:line="240" w:lineRule="auto"/>
         <w:ind w:left="720" w:right="0" w:hanging="360"/>
         <w:rPr>
-          <w:rFonts w:ascii="Noto Sans" w:cs="Noto Sans" w:eastAsia="Noto Sans" w:hAnsi="Noto Sans"/>
-        </w:rPr>
-      </w:pPr>
-      <w:r>
-        <w:rPr>
-          <w:rFonts w:ascii="Noto Sans" w:cs="Noto Sans" w:eastAsia="Noto Sans" w:hAnsi="Noto Sans"/>
-          <w:rtl w:val="0"/>
-        </w:rPr>
-        <w:t xml:space="preserve">Fundamental engineering lab skills and solid mathematical background.</w:t>
-      </w:r>
-    </w:p>
-    <w:p>
-      <w:pPr>
-        <w:pageBreakBefore w:val="0"/>
-        <w:pBdr>
-          <w:top w:space="0" w:sz="0" w:val="nil"/>
-          <w:left w:space="0" w:sz="0" w:val="nil"/>
-          <w:bottom w:space="0" w:sz="0" w:val="nil"/>
-          <w:right w:space="0" w:sz="0" w:val="nil"/>
-          <w:between w:space="0" w:sz="0" w:val="nil"/>
-        </w:pBdr>
-        <w:shd w:fill="auto" w:val="clear"/>
-        <w:spacing w:before="80" w:line="240" w:lineRule="auto"/>
-        <w:ind w:right="0"/>
-        <w:rPr/>
-      </w:pPr>
+          <w:rFonts w:ascii="Noto Sans Medium" w:cs="Noto Sans Medium" w:eastAsia="Noto Sans Medium" w:hAnsi="Noto Sans Medium"/>
+        </w:rPr>
+      </w:pPr>
+      <w:r>
+        <w:rPr>
+          <w:rFonts w:ascii="Noto Sans Medium" w:cs="Noto Sans Medium" w:eastAsia="Noto Sans Medium" w:hAnsi="Noto Sans Medium"/>
+          <w:rtl w:val="0"/>
+        </w:rPr>
+        <w:t xml:space="preserve">Studied and applied fundamental electrical and electronics engineering in a laboratory environment. </w:t>
+      </w:r>
       <w:r>
         <w:rPr>
           <w:rtl w:val="0"/>
@@ -617,23 +652,17 @@
         <w:pStyle w:val="Heading1"/>
         <w:keepNext w:val="0"/>
         <w:keepLines w:val="0"/>
-        <w:spacing w:line="240" w:lineRule="auto"/>
+        <w:spacing w:before="80" w:line="240" w:lineRule="auto"/>
         <w:ind w:left="0" w:right="0" w:firstLine="0"/>
         <w:rPr>
-          <w:rFonts w:ascii="JetBrains Mono" w:cs="JetBrains Mono" w:eastAsia="JetBrains Mono" w:hAnsi="JetBrains Mono"/>
-          <w:b w:val="1"/>
-        </w:rPr>
-      </w:pPr>
-      <w:bookmarkStart w:colFirst="0" w:colLast="0" w:name="_qttiqnuhschn" w:id="8"/>
-      <w:bookmarkEnd w:id="8"/>
-      <w:r>
-        <w:rPr>
-          <w:rtl w:val="0"/>
-        </w:rPr>
-        <w:t xml:space="preserve">  </w:t>
-      </w:r>
-      <w:r>
-        <w:rPr>
+          <w:rFonts w:ascii="Noto Sans Medium" w:cs="Noto Sans Medium" w:eastAsia="Noto Sans Medium" w:hAnsi="Noto Sans Medium"/>
+        </w:rPr>
+      </w:pPr>
+      <w:bookmarkStart w:colFirst="0" w:colLast="0" w:name="_qttiqnuhschn" w:id="6"/>
+      <w:bookmarkEnd w:id="6"/>
+      <w:r>
+        <w:rPr>
+          <w:rFonts w:ascii="Noto Sans Medium" w:cs="Noto Sans Medium" w:eastAsia="Noto Sans Medium" w:hAnsi="Noto Sans Medium"/>
           <w:u w:val="single"/>
           <w:rtl w:val="0"/>
         </w:rPr>
@@ -641,92 +670,41 @@
       </w:r>
       <w:r>
         <w:rPr>
-          <w:rtl w:val="0"/>
-        </w:rPr>
-        <w:t xml:space="preserve"> </w:t>
-      </w:r>
-      <w:r>
-        <w:rPr>
-          <w:rFonts w:ascii="JetBrains Mono" w:cs="JetBrains Mono" w:eastAsia="JetBrains Mono" w:hAnsi="JetBrains Mono"/>
+          <w:rFonts w:ascii="Noto Sans Medium" w:cs="Noto Sans Medium" w:eastAsia="Noto Sans Medium" w:hAnsi="Noto Sans Medium"/>
+          <w:rtl w:val="0"/>
+        </w:rPr>
+        <w:t xml:space="preserve"> (</w:t>
+      </w:r>
+      <w:r>
+        <w:rPr>
+          <w:rFonts w:ascii="Noto Sans Medium" w:cs="Noto Sans Medium" w:eastAsia="Noto Sans Medium" w:hAnsi="Noto Sans Medium"/>
           <w:i w:val="1"/>
-          <w:color w:val="434343"/>
-          <w:sz w:val="20"/>
-          <w:szCs w:val="20"/>
-          <w:rtl w:val="0"/>
-        </w:rPr>
-        <w:t xml:space="preserve">2018-2019</w:t>
-      </w:r>
-      <w:r>
-        <w:rPr>
-          <w:rFonts w:ascii="JetBrains Mono" w:cs="JetBrains Mono" w:eastAsia="JetBrains Mono" w:hAnsi="JetBrains Mono"/>
-          <w:color w:val="000000"/>
+          <w:rtl w:val="0"/>
+        </w:rPr>
+        <w:t xml:space="preserve">2019</w:t>
+      </w:r>
+      <w:r>
+        <w:rPr>
+          <w:rFonts w:ascii="Noto Sans Medium" w:cs="Noto Sans Medium" w:eastAsia="Noto Sans Medium" w:hAnsi="Noto Sans Medium"/>
           <w:sz w:val="22"/>
           <w:szCs w:val="22"/>
           <w:rtl w:val="0"/>
         </w:rPr>
-        <w:t xml:space="preserve"> </w:t>
-      </w:r>
-      <w:r>
-        <w:rPr>
-          <w:rtl w:val="0"/>
-        </w:rPr>
-      </w:r>
-    </w:p>
-    <w:p>
-      <w:pPr>
-        <w:pStyle w:val="Heading1"/>
-        <w:keepNext w:val="0"/>
-        <w:keepLines w:val="0"/>
-        <w:pageBreakBefore w:val="0"/>
-        <w:pBdr>
-          <w:top w:space="0" w:sz="0" w:val="nil"/>
-          <w:left w:space="0" w:sz="0" w:val="nil"/>
-          <w:bottom w:space="0" w:sz="0" w:val="nil"/>
-          <w:right w:space="0" w:sz="0" w:val="nil"/>
-          <w:between w:space="0" w:sz="0" w:val="nil"/>
-        </w:pBdr>
-        <w:shd w:fill="auto" w:val="clear"/>
-        <w:spacing w:after="200" w:before="200" w:line="240" w:lineRule="auto"/>
-        <w:ind w:left="0" w:right="0" w:firstLine="0"/>
-        <w:rPr>
-          <w:rFonts w:ascii="JetBrains Mono" w:cs="JetBrains Mono" w:eastAsia="JetBrains Mono" w:hAnsi="JetBrains Mono"/>
-          <w:b w:val="1"/>
-        </w:rPr>
-      </w:pPr>
-      <w:bookmarkStart w:colFirst="0" w:colLast="0" w:name="_lz1sd6fah1wb" w:id="9"/>
-      <w:bookmarkEnd w:id="9"/>
-      <w:r>
-        <w:br w:type="page"/>
-      </w:r>
-      <w:r>
-        <w:rPr>
-          <w:rtl w:val="0"/>
-        </w:rPr>
-      </w:r>
-    </w:p>
-    <w:p>
-      <w:pPr>
-        <w:pStyle w:val="Heading1"/>
-        <w:keepNext w:val="0"/>
-        <w:keepLines w:val="0"/>
-        <w:pageBreakBefore w:val="0"/>
-        <w:pBdr>
-          <w:top w:space="0" w:sz="0" w:val="nil"/>
-          <w:left w:space="0" w:sz="0" w:val="nil"/>
-          <w:bottom w:space="0" w:sz="0" w:val="nil"/>
-          <w:right w:space="0" w:sz="0" w:val="nil"/>
-          <w:between w:space="0" w:sz="0" w:val="nil"/>
-        </w:pBdr>
-        <w:shd w:fill="auto" w:val="clear"/>
-        <w:spacing w:after="200" w:before="200" w:line="240" w:lineRule="auto"/>
-        <w:ind w:left="0" w:right="0" w:firstLine="0"/>
-        <w:rPr>
-          <w:rFonts w:ascii="JetBrains Mono" w:cs="JetBrains Mono" w:eastAsia="JetBrains Mono" w:hAnsi="JetBrains Mono"/>
-          <w:b w:val="1"/>
-        </w:rPr>
-      </w:pPr>
-      <w:bookmarkStart w:colFirst="0" w:colLast="0" w:name="_4kzarxebqe98" w:id="10"/>
-      <w:bookmarkEnd w:id="10"/>
+        <w:t xml:space="preserve">)</w:t>
+      </w:r>
+      <w:r>
+        <w:rPr>
+          <w:rtl w:val="0"/>
+        </w:rPr>
+      </w:r>
+    </w:p>
+    <w:p>
+      <w:pPr>
+        <w:pStyle w:val="Subtitle"/>
+        <w:rPr/>
+      </w:pPr>
+      <w:bookmarkStart w:colFirst="0" w:colLast="0" w:name="_pwnp1k6vsbh1" w:id="7"/>
+      <w:bookmarkEnd w:id="7"/>
       <w:r>
         <w:pict>
           <v:rect style="width:0.0pt;height:1.5pt" o:hr="t" o:hrstd="t" o:hralign="center" fillcolor="#A0A0A0" stroked="f"/>
@@ -736,44 +714,7 @@
         <w:rPr>
           <w:rtl w:val="0"/>
         </w:rPr>
-      </w:r>
-    </w:p>
-    <w:p>
-      <w:pPr>
-        <w:pStyle w:val="Heading1"/>
-        <w:keepNext w:val="0"/>
-        <w:keepLines w:val="0"/>
-        <w:pageBreakBefore w:val="0"/>
-        <w:pBdr>
-          <w:top w:space="0" w:sz="0" w:val="nil"/>
-          <w:left w:space="0" w:sz="0" w:val="nil"/>
-          <w:bottom w:space="0" w:sz="0" w:val="nil"/>
-          <w:right w:space="0" w:sz="0" w:val="nil"/>
-          <w:between w:space="0" w:sz="0" w:val="nil"/>
-        </w:pBdr>
-        <w:shd w:fill="auto" w:val="clear"/>
-        <w:spacing w:after="200" w:before="200" w:line="240" w:lineRule="auto"/>
-        <w:ind w:left="0" w:right="0" w:firstLine="0"/>
-        <w:rPr>
-          <w:rFonts w:ascii="JetBrains Mono" w:cs="JetBrains Mono" w:eastAsia="JetBrains Mono" w:hAnsi="JetBrains Mono"/>
-        </w:rPr>
-      </w:pPr>
-      <w:bookmarkStart w:colFirst="0" w:colLast="0" w:name="_pwnp1k6vsbh1" w:id="11"/>
-      <w:bookmarkEnd w:id="11"/>
-      <w:r>
-        <w:rPr>
-          <w:rFonts w:ascii="JetBrains Mono" w:cs="JetBrains Mono" w:eastAsia="JetBrains Mono" w:hAnsi="JetBrains Mono"/>
-          <w:b w:val="1"/>
-          <w:sz w:val="28"/>
-          <w:szCs w:val="28"/>
-          <w:rtl w:val="0"/>
-        </w:rPr>
         <w:t xml:space="preserve">Relevant Skills</w:t>
-      </w:r>
-      <w:r>
-        <w:rPr>
-          <w:rtl w:val="0"/>
-        </w:rPr>
       </w:r>
     </w:p>
     <w:p>
@@ -794,15 +735,30 @@
         <w:spacing w:before="120" w:line="240" w:lineRule="auto"/>
         <w:ind w:left="720" w:right="0" w:hanging="360"/>
         <w:rPr>
-          <w:rFonts w:ascii="Noto Sans" w:cs="Noto Sans" w:eastAsia="Noto Sans" w:hAnsi="Noto Sans"/>
-        </w:rPr>
-      </w:pPr>
-      <w:r>
-        <w:rPr>
-          <w:rFonts w:ascii="Noto Sans" w:cs="Noto Sans" w:eastAsia="Noto Sans" w:hAnsi="Noto Sans"/>
-          <w:rtl w:val="0"/>
-        </w:rPr>
-        <w:t xml:space="preserve">Multi-language programming in Python, Java, C, C++, JavaScript, Haskell and the ability to learn new languages quickly. </w:t>
+          <w:rFonts w:ascii="Noto Sans Medium" w:cs="Noto Sans Medium" w:eastAsia="Noto Sans Medium" w:hAnsi="Noto Sans Medium"/>
+        </w:rPr>
+      </w:pPr>
+      <w:r>
+        <w:rPr>
+          <w:rFonts w:ascii="Noto Sans Medium" w:cs="Noto Sans Medium" w:eastAsia="Noto Sans Medium" w:hAnsi="Noto Sans Medium"/>
+          <w:rtl w:val="0"/>
+        </w:rPr>
+        <w:t xml:space="preserve">Multi-language programming in Python, Java, C, C++, JavaScript, Haskell and the ability to learn new languages quickly. Proficient in multiple high-level, object-oriented and functional programming languages including </w:t>
+      </w:r>
+      <w:r>
+        <w:rPr>
+          <w:rFonts w:ascii="Noto Sans Medium" w:cs="Noto Sans Medium" w:eastAsia="Noto Sans Medium" w:hAnsi="Noto Sans Medium"/>
+          <w:u w:val="single"/>
+          <w:rtl w:val="0"/>
+        </w:rPr>
+        <w:t xml:space="preserve">but not limited to</w:t>
+      </w:r>
+      <w:r>
+        <w:rPr>
+          <w:rFonts w:ascii="Noto Sans Medium" w:cs="Noto Sans Medium" w:eastAsia="Noto Sans Medium" w:hAnsi="Noto Sans Medium"/>
+          <w:rtl w:val="0"/>
+        </w:rPr>
+        <w:t xml:space="preserve"> C, C++, Python, Java, JavaScript</w:t>
       </w:r>
     </w:p>
     <w:p>
@@ -823,15 +779,20 @@
         <w:spacing w:after="0" w:before="120" w:line="240" w:lineRule="auto"/>
         <w:ind w:left="720" w:right="0" w:hanging="360"/>
         <w:rPr>
-          <w:rFonts w:ascii="Noto Sans" w:cs="Noto Sans" w:eastAsia="Noto Sans" w:hAnsi="Noto Sans"/>
-        </w:rPr>
-      </w:pPr>
-      <w:r>
-        <w:rPr>
-          <w:rFonts w:ascii="Noto Sans" w:cs="Noto Sans" w:eastAsia="Noto Sans" w:hAnsi="Noto Sans"/>
-          <w:rtl w:val="0"/>
-        </w:rPr>
-        <w:t xml:space="preserve">Linux/Unix shell scripting with bash and Batch scripting in Windows. General purpose scripting with python and Lua</w:t>
+          <w:rFonts w:ascii="Noto Sans Medium" w:cs="Noto Sans Medium" w:eastAsia="Noto Sans Medium" w:hAnsi="Noto Sans Medium"/>
+        </w:rPr>
+      </w:pPr>
+      <w:r>
+        <w:rPr>
+          <w:rFonts w:ascii="Noto Sans Medium" w:cs="Noto Sans Medium" w:eastAsia="Noto Sans Medium" w:hAnsi="Noto Sans Medium"/>
+          <w:rtl w:val="0"/>
+        </w:rPr>
+        <w:t xml:space="preserve">Experienced at scripting and automation using Bash for Linux/Unix and Batch for Windows. </w:t>
+      </w:r>
+      <w:r>
+        <w:rPr>
+          <w:rtl w:val="0"/>
+        </w:rPr>
       </w:r>
     </w:p>
     <w:p>
@@ -852,15 +813,15 @@
         <w:spacing w:after="0" w:before="120" w:line="240" w:lineRule="auto"/>
         <w:ind w:left="720" w:right="0" w:hanging="360"/>
         <w:rPr>
-          <w:rFonts w:ascii="Noto Sans" w:cs="Noto Sans" w:eastAsia="Noto Sans" w:hAnsi="Noto Sans"/>
-        </w:rPr>
-      </w:pPr>
-      <w:r>
-        <w:rPr>
-          <w:rFonts w:ascii="Noto Sans" w:cs="Noto Sans" w:eastAsia="Noto Sans" w:hAnsi="Noto Sans"/>
-          <w:rtl w:val="0"/>
-        </w:rPr>
-        <w:t xml:space="preserve">Experienced with standard Linux/Unix CLI tools including SSH remote management. </w:t>
+          <w:rFonts w:ascii="Noto Sans Medium" w:cs="Noto Sans Medium" w:eastAsia="Noto Sans Medium" w:hAnsi="Noto Sans Medium"/>
+        </w:rPr>
+      </w:pPr>
+      <w:r>
+        <w:rPr>
+          <w:rFonts w:ascii="Noto Sans Medium" w:cs="Noto Sans Medium" w:eastAsia="Noto Sans Medium" w:hAnsi="Noto Sans Medium"/>
+          <w:rtl w:val="0"/>
+        </w:rPr>
+        <w:t xml:space="preserve">Extremely comfortable with developing software in either a Windows environment or a Linux/Unix environment (Debian, Ubuntu, MacOS and more). </w:t>
       </w:r>
     </w:p>
     <w:p>
@@ -881,15 +842,16 @@
         <w:spacing w:after="0" w:before="120" w:line="240" w:lineRule="auto"/>
         <w:ind w:left="720" w:right="0" w:hanging="360"/>
         <w:rPr>
-          <w:rFonts w:ascii="Noto Sans" w:cs="Noto Sans" w:eastAsia="Noto Sans" w:hAnsi="Noto Sans"/>
-        </w:rPr>
-      </w:pPr>
-      <w:r>
-        <w:rPr>
-          <w:rFonts w:ascii="Noto Sans" w:cs="Noto Sans" w:eastAsia="Noto Sans" w:hAnsi="Noto Sans"/>
-          <w:rtl w:val="0"/>
-        </w:rPr>
-        <w:t xml:space="preserve">Proficient with standard software build tools such as Maven and Cmake.</w:t>
+          <w:rFonts w:ascii="Noto Sans Medium" w:cs="Noto Sans Medium" w:eastAsia="Noto Sans Medium" w:hAnsi="Noto Sans Medium"/>
+          <w:u w:val="none"/>
+        </w:rPr>
+      </w:pPr>
+      <w:r>
+        <w:rPr>
+          <w:rFonts w:ascii="Noto Sans Medium" w:cs="Noto Sans Medium" w:eastAsia="Noto Sans Medium" w:hAnsi="Noto Sans Medium"/>
+          <w:rtl w:val="0"/>
+        </w:rPr>
+        <w:t xml:space="preserve">Experienced with Git and GitHub/GitLab for version control workflows. As well as working in a team of developers using AGILE project management principles. </w:t>
       </w:r>
     </w:p>
     <w:p>
@@ -910,15 +872,20 @@
         <w:spacing w:after="0" w:before="120" w:line="240" w:lineRule="auto"/>
         <w:ind w:left="720" w:right="0" w:hanging="360"/>
         <w:rPr>
-          <w:rFonts w:ascii="Noto Sans" w:cs="Noto Sans" w:eastAsia="Noto Sans" w:hAnsi="Noto Sans"/>
-        </w:rPr>
-      </w:pPr>
-      <w:r>
-        <w:rPr>
-          <w:rFonts w:ascii="Noto Sans" w:cs="Noto Sans" w:eastAsia="Noto Sans" w:hAnsi="Noto Sans"/>
-          <w:rtl w:val="0"/>
-        </w:rPr>
-        <w:t xml:space="preserve">Proficient with Git and GitHub/GitLab version control workflows.</w:t>
+          <w:rFonts w:ascii="Noto Sans Medium" w:cs="Noto Sans Medium" w:eastAsia="Noto Sans Medium" w:hAnsi="Noto Sans Medium"/>
+        </w:rPr>
+      </w:pPr>
+      <w:r>
+        <w:rPr>
+          <w:rFonts w:ascii="Noto Sans Medium" w:cs="Noto Sans Medium" w:eastAsia="Noto Sans Medium" w:hAnsi="Noto Sans Medium"/>
+          <w:rtl w:val="0"/>
+        </w:rPr>
+        <w:t xml:space="preserve">Proficient with standard software build tools such as Maven and Cmake.</w:t>
+      </w:r>
+      <w:r>
+        <w:rPr>
+          <w:rtl w:val="0"/>
+        </w:rPr>
       </w:r>
     </w:p>
     <w:p>
@@ -939,36 +906,35 @@
         <w:spacing w:before="120" w:line="240" w:lineRule="auto"/>
         <w:ind w:left="720" w:right="0" w:hanging="360"/>
         <w:rPr>
-          <w:rFonts w:ascii="Noto Sans" w:cs="Noto Sans" w:eastAsia="Noto Sans" w:hAnsi="Noto Sans"/>
-        </w:rPr>
-      </w:pPr>
-      <w:r>
-        <w:rPr>
-          <w:rFonts w:ascii="Noto Sans" w:cs="Noto Sans" w:eastAsia="Noto Sans" w:hAnsi="Noto Sans"/>
-          <w:rtl w:val="0"/>
-        </w:rPr>
-        <w:t xml:space="preserve">Front-end web development with pure JS, CSS and HTML as well as using JavaScript frameworks (primarily Google’s Flutter)</w:t>
-      </w:r>
-      <w:r>
-        <w:rPr>
-          <w:rtl w:val="0"/>
-        </w:rPr>
-      </w:r>
-    </w:p>
-    <w:p>
-      <w:pPr>
-        <w:pStyle w:val="Heading1"/>
+          <w:rFonts w:ascii="Noto Sans Medium" w:cs="Noto Sans Medium" w:eastAsia="Noto Sans Medium" w:hAnsi="Noto Sans Medium"/>
+        </w:rPr>
+      </w:pPr>
+      <w:r>
+        <w:rPr>
+          <w:rFonts w:ascii="Noto Sans Medium" w:cs="Noto Sans Medium" w:eastAsia="Noto Sans Medium" w:hAnsi="Noto Sans Medium"/>
+          <w:rtl w:val="0"/>
+        </w:rPr>
+        <w:t xml:space="preserve">Front-end web development with pure JS, CSS and HTML as well as using JavaScript frameworks (currently primarily Google’s Flutter)</w:t>
+      </w:r>
+      <w:r>
+        <w:rPr>
+          <w:rtl w:val="0"/>
+        </w:rPr>
+      </w:r>
+    </w:p>
+    <w:p>
+      <w:pPr>
+        <w:pStyle w:val="Subtitle"/>
         <w:keepNext w:val="0"/>
         <w:keepLines w:val="0"/>
-        <w:spacing w:after="0" w:before="200" w:line="240" w:lineRule="auto"/>
-        <w:ind w:left="0" w:right="0" w:firstLine="0"/>
-        <w:rPr>
-          <w:rFonts w:ascii="JetBrains Mono" w:cs="JetBrains Mono" w:eastAsia="JetBrains Mono" w:hAnsi="JetBrains Mono"/>
-          <w:b w:val="1"/>
-        </w:rPr>
-      </w:pPr>
-      <w:bookmarkStart w:colFirst="0" w:colLast="0" w:name="_xa4khn5qyllz" w:id="12"/>
-      <w:bookmarkEnd w:id="12"/>
+        <w:spacing w:after="0" w:before="0" w:lineRule="auto"/>
+        <w:rPr>
+          <w:rFonts w:ascii="Noto Sans Medium" w:cs="Noto Sans Medium" w:eastAsia="Noto Sans Medium" w:hAnsi="Noto Sans Medium"/>
+          <w:b w:val="0"/>
+        </w:rPr>
+      </w:pPr>
+      <w:bookmarkStart w:colFirst="0" w:colLast="0" w:name="_y8yp6nfpxm3r" w:id="8"/>
+      <w:bookmarkEnd w:id="8"/>
       <w:r>
         <w:pict>
           <v:rect style="width:0.0pt;height:1.5pt" o:hr="t" o:hrstd="t" o:hralign="center" fillcolor="#A0A0A0" stroked="f"/>
@@ -982,29 +948,83 @@
     </w:p>
     <w:p>
       <w:pPr>
-        <w:pStyle w:val="Heading1"/>
-        <w:keepNext w:val="0"/>
-        <w:keepLines w:val="0"/>
-        <w:spacing w:after="0" w:before="200" w:line="240" w:lineRule="auto"/>
-        <w:ind w:left="0" w:right="0" w:firstLine="0"/>
-        <w:rPr>
-          <w:rFonts w:ascii="JetBrains Mono" w:cs="JetBrains Mono" w:eastAsia="JetBrains Mono" w:hAnsi="JetBrains Mono"/>
-          <w:b w:val="1"/>
-          <w:sz w:val="28"/>
-          <w:szCs w:val="28"/>
-        </w:rPr>
-      </w:pPr>
-      <w:bookmarkStart w:colFirst="0" w:colLast="0" w:name="_dyots79h7ixj" w:id="13"/>
-      <w:bookmarkEnd w:id="13"/>
-      <w:r>
-        <w:rPr>
-          <w:rFonts w:ascii="JetBrains Mono" w:cs="JetBrains Mono" w:eastAsia="JetBrains Mono" w:hAnsi="JetBrains Mono"/>
-          <w:b w:val="1"/>
-          <w:sz w:val="28"/>
-          <w:szCs w:val="28"/>
+        <w:pStyle w:val="Subtitle"/>
+        <w:rPr>
+          <w:rFonts w:ascii="Noto Sans Medium" w:cs="Noto Sans Medium" w:eastAsia="Noto Sans Medium" w:hAnsi="Noto Sans Medium"/>
+        </w:rPr>
+      </w:pPr>
+      <w:bookmarkStart w:colFirst="0" w:colLast="0" w:name="_dyots79h7ixj" w:id="9"/>
+      <w:bookmarkEnd w:id="9"/>
+      <w:r>
+        <w:rPr>
           <w:rtl w:val="0"/>
         </w:rPr>
         <w:t xml:space="preserve">Relevant Interests</w:t>
+      </w:r>
+      <w:r>
+        <w:rPr>
+          <w:rtl w:val="0"/>
+        </w:rPr>
+      </w:r>
+    </w:p>
+    <w:p>
+      <w:pPr>
+        <w:numPr>
+          <w:ilvl w:val="0"/>
+          <w:numId w:val="3"/>
+        </w:numPr>
+        <w:spacing w:before="120" w:lineRule="auto"/>
+        <w:ind w:left="720" w:hanging="360"/>
+        <w:rPr>
+          <w:rFonts w:ascii="Noto Sans Medium" w:cs="Noto Sans Medium" w:eastAsia="Noto Sans Medium" w:hAnsi="Noto Sans Medium"/>
+        </w:rPr>
+      </w:pPr>
+      <w:r>
+        <w:rPr>
+          <w:rFonts w:ascii="Noto Sans Medium" w:cs="Noto Sans Medium" w:eastAsia="Noto Sans Medium" w:hAnsi="Noto Sans Medium"/>
+          <w:rtl w:val="0"/>
+        </w:rPr>
+        <w:t xml:space="preserve">Experienced with enthusiast overclocking or more accurately, the modification of voltage-frequency curves and boost algorithms to achieve the best performance possible in power or thermally limited custom PCs or single board computers.</w:t>
+      </w:r>
+    </w:p>
+    <w:p>
+      <w:pPr>
+        <w:numPr>
+          <w:ilvl w:val="0"/>
+          <w:numId w:val="3"/>
+        </w:numPr>
+        <w:spacing w:after="0" w:before="120" w:line="240" w:lineRule="auto"/>
+        <w:ind w:left="720" w:right="0" w:hanging="360"/>
+        <w:rPr>
+          <w:rFonts w:ascii="Noto Sans Medium" w:cs="Noto Sans Medium" w:eastAsia="Noto Sans Medium" w:hAnsi="Noto Sans Medium"/>
+        </w:rPr>
+      </w:pPr>
+      <w:r>
+        <w:rPr>
+          <w:rFonts w:ascii="Noto Sans Medium" w:cs="Noto Sans Medium" w:eastAsia="Noto Sans Medium" w:hAnsi="Noto Sans Medium"/>
+          <w:rtl w:val="0"/>
+        </w:rPr>
+        <w:t xml:space="preserve">“HomeLab” style local server hosting for personal use tying in with actual web hosting such as for my personal site. </w:t>
+      </w:r>
+    </w:p>
+    <w:p>
+      <w:pPr>
+        <w:numPr>
+          <w:ilvl w:val="0"/>
+          <w:numId w:val="3"/>
+        </w:numPr>
+        <w:spacing w:after="0" w:before="120" w:line="240" w:lineRule="auto"/>
+        <w:ind w:left="720" w:right="0" w:hanging="360"/>
+        <w:rPr>
+          <w:rFonts w:ascii="Noto Sans Medium" w:cs="Noto Sans Medium" w:eastAsia="Noto Sans Medium" w:hAnsi="Noto Sans Medium"/>
+        </w:rPr>
+      </w:pPr>
+      <w:r>
+        <w:rPr>
+          <w:rFonts w:ascii="Noto Sans Medium" w:cs="Noto Sans Medium" w:eastAsia="Noto Sans Medium" w:hAnsi="Noto Sans Medium"/>
+          <w:rtl w:val="0"/>
+        </w:rPr>
+        <w:t xml:space="preserve">Raspberry Pi for robotics, electronics and server hosting projects. </w:t>
       </w:r>
     </w:p>
     <w:p>
@@ -1016,72 +1036,12 @@
         <w:spacing w:before="120" w:line="240" w:lineRule="auto"/>
         <w:ind w:left="720" w:right="0" w:hanging="360"/>
         <w:rPr>
-          <w:rFonts w:ascii="Noto Sans" w:cs="Noto Sans" w:eastAsia="Noto Sans" w:hAnsi="Noto Sans"/>
-        </w:rPr>
-      </w:pPr>
-      <w:r>
-        <w:rPr>
-          <w:rFonts w:ascii="Noto Sans" w:cs="Noto Sans" w:eastAsia="Noto Sans" w:hAnsi="Noto Sans"/>
-          <w:rtl w:val="0"/>
-        </w:rPr>
-        <w:t xml:space="preserve">Enthusiast high-performance personal computing hardware including advanced overclocking and performance tweaking. </w:t>
-      </w:r>
-    </w:p>
-    <w:p>
-      <w:pPr>
-        <w:numPr>
-          <w:ilvl w:val="0"/>
-          <w:numId w:val="3"/>
-        </w:numPr>
-        <w:spacing w:after="0" w:before="120" w:line="240" w:lineRule="auto"/>
-        <w:ind w:left="720" w:right="0" w:hanging="360"/>
-        <w:rPr>
-          <w:rFonts w:ascii="Noto Sans" w:cs="Noto Sans" w:eastAsia="Noto Sans" w:hAnsi="Noto Sans"/>
-        </w:rPr>
-      </w:pPr>
-      <w:r>
-        <w:rPr>
-          <w:rFonts w:ascii="Noto Sans" w:cs="Noto Sans" w:eastAsia="Noto Sans" w:hAnsi="Noto Sans"/>
-          <w:rtl w:val="0"/>
-        </w:rPr>
-        <w:t xml:space="preserve">“HomeLab” style local server hosting for personal use tying in with actual web hosting such as for my personal site. </w:t>
-      </w:r>
-    </w:p>
-    <w:p>
-      <w:pPr>
-        <w:numPr>
-          <w:ilvl w:val="0"/>
-          <w:numId w:val="3"/>
-        </w:numPr>
-        <w:spacing w:after="0" w:before="120" w:line="240" w:lineRule="auto"/>
-        <w:ind w:left="720" w:right="0" w:hanging="360"/>
-        <w:rPr>
-          <w:rFonts w:ascii="Noto Sans" w:cs="Noto Sans" w:eastAsia="Noto Sans" w:hAnsi="Noto Sans"/>
-        </w:rPr>
-      </w:pPr>
-      <w:r>
-        <w:rPr>
-          <w:rFonts w:ascii="Noto Sans" w:cs="Noto Sans" w:eastAsia="Noto Sans" w:hAnsi="Noto Sans"/>
-          <w:rtl w:val="0"/>
-        </w:rPr>
-        <w:t xml:space="preserve">Raspberry Pi for robotics, electronics and server hosting projects. </w:t>
-      </w:r>
-    </w:p>
-    <w:p>
-      <w:pPr>
-        <w:numPr>
-          <w:ilvl w:val="0"/>
-          <w:numId w:val="3"/>
-        </w:numPr>
-        <w:spacing w:before="120" w:line="240" w:lineRule="auto"/>
-        <w:ind w:left="720" w:right="0" w:hanging="360"/>
-        <w:rPr>
-          <w:rFonts w:ascii="Noto Sans" w:cs="Noto Sans" w:eastAsia="Noto Sans" w:hAnsi="Noto Sans"/>
-        </w:rPr>
-      </w:pPr>
-      <w:r>
-        <w:rPr>
-          <w:rFonts w:ascii="Noto Sans" w:cs="Noto Sans" w:eastAsia="Noto Sans" w:hAnsi="Noto Sans"/>
+          <w:rFonts w:ascii="Noto Sans Medium" w:cs="Noto Sans Medium" w:eastAsia="Noto Sans Medium" w:hAnsi="Noto Sans Medium"/>
+        </w:rPr>
+      </w:pPr>
+      <w:r>
+        <w:rPr>
+          <w:rFonts w:ascii="Noto Sans Medium" w:cs="Noto Sans Medium" w:eastAsia="Noto Sans Medium" w:hAnsi="Noto Sans Medium"/>
           <w:rtl w:val="0"/>
         </w:rPr>
         <w:t xml:space="preserve">Co-founder and committee member of the University of Southampton’s Powerlifting sports club. Helping to bring the team to, as well as personally competing in, the British Universities and Colleges Sport (BUCS) Powerlifting National Championships 2023. </w:t>
@@ -1586,14 +1546,10 @@
     <w:pPr>
       <w:keepNext w:val="1"/>
       <w:keepLines w:val="1"/>
-      <w:spacing w:before="0" w:line="240" w:lineRule="auto"/>
-      <w:ind w:right="-1800"/>
+      <w:spacing w:before="0" w:lineRule="auto"/>
     </w:pPr>
     <w:rPr>
       <w:rFonts w:ascii="JetBrains Mono SemiBold" w:cs="JetBrains Mono SemiBold" w:eastAsia="JetBrains Mono SemiBold" w:hAnsi="JetBrains Mono SemiBold"/>
-      <w:color w:val="0b5394"/>
-      <w:sz w:val="24"/>
-      <w:szCs w:val="24"/>
     </w:rPr>
   </w:style>
   <w:style w:type="paragraph" w:styleId="Heading2">
@@ -1706,15 +1662,12 @@
     <w:pPr>
       <w:keepNext w:val="1"/>
       <w:keepLines w:val="1"/>
-      <w:spacing w:before="0" w:line="240" w:lineRule="auto"/>
-      <w:ind w:right="-1800"/>
+      <w:spacing w:after="80" w:lineRule="auto"/>
     </w:pPr>
     <w:rPr>
-      <w:rFonts w:ascii="JetBrains Mono" w:cs="JetBrains Mono" w:eastAsia="JetBrains Mono" w:hAnsi="JetBrains Mono"/>
       <w:b w:val="1"/>
-      <w:color w:val="0b5394"/>
-      <w:sz w:val="28"/>
-      <w:szCs w:val="28"/>
+      <w:sz w:val="36"/>
+      <w:szCs w:val="36"/>
     </w:rPr>
   </w:style>
 </w:styles>

</xml_diff>